<commit_message>
Added Animation and AnimatedSprite classes
</commit_message>
<xml_diff>
--- a/notite_licenta.docx
+++ b/notite_licenta.docx
@@ -460,6 +460,11 @@
       <w:r>
         <w:br/>
         <w:t>8. Collider.h constructor pentru floatrect si intrect (override si delegate?)</w:t>
+      </w:r>
+    </w:p>
+    <w:p>
+      <w:r>
+        <w:t>9. staticsprite are parametri protected ca sa poata fi publici pentru animatedsprite cand da inherit</w:t>
       </w:r>
     </w:p>
     <w:sectPr>

</xml_diff>